<commit_message>
Equals method and collections - ArrayList/Arraya
</commit_message>
<xml_diff>
--- a/src/lecture10_MiscTopics/Lecture10_MiscTopics.docx
+++ b/src/lecture10_MiscTopics/Lecture10_MiscTopics.docx
@@ -1490,6 +1490,9 @@
       <w:r>
         <w:t>Java creates a string pool which contains all the string literals that you use in the program. When you create a new String using a literal, Java checks the String Pool. If a String with the same value already exists, it reuses it.</w:t>
       </w:r>
+      <w:r>
+        <w:t xml:space="preserve"> This process is called string “interning”.</w:t>
+      </w:r>
     </w:p>
     <w:p>
       <w:pPr>
@@ -1866,6 +1869,11 @@
       <w:pPr>
         <w:spacing w:before="80" w:after="80"/>
         <w:ind w:left="432"/>
+        <w:rPr>
+          <w:rFonts w:ascii="Consolas" w:hAnsi="Consolas"/>
+          <w:color w:val="005078"/>
+          <w:sz w:val="18"/>
+        </w:rPr>
       </w:pPr>
       <w:r>
         <w:rPr>
@@ -1874,6 +1882,47 @@
           <w:sz w:val="18"/>
         </w:rPr>
         <w:t>String greeting = "Assalam o Alaikum";</w:t>
+      </w:r>
+    </w:p>
+    <w:p>
+      <w:pPr>
+        <w:spacing w:before="80" w:after="80"/>
+        <w:ind w:left="432"/>
+        <w:rPr>
+          <w:rFonts w:ascii="Consolas" w:hAnsi="Consolas"/>
+          <w:color w:val="005078"/>
+          <w:sz w:val="18"/>
+        </w:rPr>
+      </w:pPr>
+      <w:r>
+        <w:rPr>
+          <w:rFonts w:ascii="Consolas" w:hAnsi="Consolas"/>
+          <w:color w:val="005078"/>
+          <w:sz w:val="18"/>
+        </w:rPr>
+        <w:t>greeting = greeting + “abc”;</w:t>
+      </w:r>
+    </w:p>
+    <w:p>
+      <w:pPr>
+        <w:spacing w:before="80" w:after="80"/>
+        <w:ind w:left="432"/>
+      </w:pPr>
+      <w:r>
+        <w:rPr>
+          <w:rFonts w:ascii="Consolas" w:hAnsi="Consolas"/>
+          <w:color w:val="005078"/>
+          <w:sz w:val="18"/>
+        </w:rPr>
+        <w:t>greeting[0] = ‘G’;</w:t>
+      </w:r>
+      <w:r>
+        <w:rPr>
+          <w:rFonts w:ascii="Consolas" w:hAnsi="Consolas"/>
+          <w:color w:val="005078"/>
+          <w:sz w:val="18"/>
+        </w:rPr>
+        <w:t xml:space="preserve"> // Error</w:t>
       </w:r>
       <w:r>
         <w:rPr>
@@ -1913,6 +1962,7 @@
     </w:p>
     <w:p>
       <w:r>
+        <w:lastRenderedPageBreak/>
         <w:t>Every String method that appears to "modify" the string actually returns a new String object. The original remains untouched.</w:t>
       </w:r>
     </w:p>
@@ -1921,7 +1971,6 @@
         <w:pStyle w:val="Heading2"/>
       </w:pPr>
       <w:r>
-        <w:lastRenderedPageBreak/>
         <w:t>Why is String Immutable?</w:t>
       </w:r>
     </w:p>
@@ -1932,6 +1981,9 @@
       <w:r>
         <w:t>Safety — Strings passed to methods cannot be changed unexpectedly</w:t>
       </w:r>
+      <w:r>
+        <w:t>.</w:t>
+      </w:r>
     </w:p>
     <w:p>
       <w:pPr>
@@ -1967,6 +2019,11 @@
     <w:p>
       <w:r>
         <w:t>Every class in Java automatically extends the Object class. This means every class inherits methods like toString() and equals(). By overriding them, we customize their behavior.</w:t>
+      </w:r>
+    </w:p>
+    <w:p>
+      <w:r>
+        <w:t>// Object obj = new Object();</w:t>
       </w:r>
     </w:p>
     <w:p>
@@ -2464,359 +2521,6 @@
         </w:tc>
       </w:tr>
     </w:tbl>
-    <w:p>
-      <w:r>
-        <w:br w:type="page"/>
-      </w:r>
-    </w:p>
-    <w:p>
-      <w:pPr>
-        <w:pStyle w:val="Heading1"/>
-      </w:pPr>
-      <w:r>
-        <w:lastRenderedPageBreak/>
-        <w:t>5. Practice Exercises</w:t>
-      </w:r>
-    </w:p>
-    <w:p>
-      <w:pPr>
-        <w:pStyle w:val="Heading2"/>
-      </w:pPr>
-      <w:r>
-        <w:t>Exercise 1: Book Copy Constructor</w:t>
-      </w:r>
-    </w:p>
-    <w:p>
-      <w:r>
-        <w:t>Create a Book class with fields: title (String), price (double), and author (Author). The Author class has name (String) and email (String).</w:t>
-      </w:r>
-    </w:p>
-    <w:p>
-      <w:pPr>
-        <w:pStyle w:val="ListBullet"/>
-      </w:pPr>
-      <w:r>
-        <w:t>Tasks:</w:t>
-      </w:r>
-    </w:p>
-    <w:p>
-      <w:pPr>
-        <w:pStyle w:val="ListBullet2"/>
-      </w:pPr>
-      <w:r>
-        <w:t>Write a copy constructor for Author</w:t>
-      </w:r>
-    </w:p>
-    <w:p>
-      <w:pPr>
-        <w:pStyle w:val="ListBullet2"/>
-      </w:pPr>
-      <w:r>
-        <w:t>Write a deep copy constructor for Book</w:t>
-      </w:r>
-    </w:p>
-    <w:p>
-      <w:pPr>
-        <w:pStyle w:val="ListBullet2"/>
-      </w:pPr>
-      <w:r>
-        <w:t>Demonstrate that modifying the copy does not affect the original</w:t>
-      </w:r>
-    </w:p>
-    <w:p>
-      <w:pPr>
-        <w:pStyle w:val="Heading2"/>
-      </w:pPr>
-      <w:r>
-        <w:t>Exercise 2: University Composition &amp; Aggregation</w:t>
-      </w:r>
-    </w:p>
-    <w:p>
-      <w:r>
-        <w:t>Design a small system with:</w:t>
-      </w:r>
-    </w:p>
-    <w:p>
-      <w:pPr>
-        <w:pStyle w:val="ListBullet"/>
-      </w:pPr>
-      <w:r>
-        <w:t>Department class (name, head of department)</w:t>
-      </w:r>
-    </w:p>
-    <w:p>
-      <w:pPr>
-        <w:pStyle w:val="ListBullet"/>
-      </w:pPr>
-      <w:r>
-        <w:t>University class that composes Departments (creates and owns them)</w:t>
-      </w:r>
-    </w:p>
-    <w:p>
-      <w:pPr>
-        <w:pStyle w:val="ListBullet"/>
-      </w:pPr>
-      <w:r>
-        <w:t>Student class (name, rollNumber)</w:t>
-      </w:r>
-    </w:p>
-    <w:p>
-      <w:pPr>
-        <w:pStyle w:val="ListBullet"/>
-      </w:pPr>
-      <w:r>
-        <w:t>Course class that aggregates Students (references but doesn't own them)</w:t>
-      </w:r>
-    </w:p>
-    <w:p>
-      <w:pPr>
-        <w:pStyle w:val="ListBullet"/>
-      </w:pPr>
-      <w:r>
-        <w:t>Tasks:</w:t>
-      </w:r>
-    </w:p>
-    <w:p>
-      <w:pPr>
-        <w:pStyle w:val="ListBullet2"/>
-      </w:pPr>
-      <w:r>
-        <w:t>Identify which relationships are composition vs aggregation</w:t>
-      </w:r>
-    </w:p>
-    <w:p>
-      <w:pPr>
-        <w:pStyle w:val="ListBullet2"/>
-      </w:pPr>
-      <w:r>
-        <w:t>Write the classes with appropriate constructors</w:t>
-      </w:r>
-    </w:p>
-    <w:p>
-      <w:pPr>
-        <w:pStyle w:val="ListBullet2"/>
-      </w:pPr>
-      <w:r>
-        <w:t>Write a main method demonstrating both relationships</w:t>
-      </w:r>
-    </w:p>
-    <w:p>
-      <w:pPr>
-        <w:pStyle w:val="Heading2"/>
-      </w:pPr>
-      <w:r>
-        <w:t>Exercise 3: String Immutability</w:t>
-      </w:r>
-    </w:p>
-    <w:p>
-      <w:r>
-        <w:t>What will the following code print? Trace through it without running first, then verify:</w:t>
-      </w:r>
-    </w:p>
-    <w:p>
-      <w:pPr>
-        <w:spacing w:before="80" w:after="80"/>
-        <w:ind w:left="432"/>
-      </w:pPr>
-      <w:r>
-        <w:rPr>
-          <w:rFonts w:ascii="Consolas" w:hAnsi="Consolas"/>
-          <w:color w:val="005078"/>
-          <w:sz w:val="18"/>
-        </w:rPr>
-        <w:t>String a = "Pakistan";</w:t>
-      </w:r>
-      <w:r>
-        <w:rPr>
-          <w:rFonts w:ascii="Consolas" w:hAnsi="Consolas"/>
-          <w:color w:val="005078"/>
-          <w:sz w:val="18"/>
-        </w:rPr>
-        <w:br/>
-        <w:t>String b = "Pakistan";</w:t>
-      </w:r>
-      <w:r>
-        <w:rPr>
-          <w:rFonts w:ascii="Consolas" w:hAnsi="Consolas"/>
-          <w:color w:val="005078"/>
-          <w:sz w:val="18"/>
-        </w:rPr>
-        <w:br/>
-        <w:t>String c = new String("Pakistan");</w:t>
-      </w:r>
-      <w:r>
-        <w:rPr>
-          <w:rFonts w:ascii="Consolas" w:hAnsi="Consolas"/>
-          <w:color w:val="005078"/>
-          <w:sz w:val="18"/>
-        </w:rPr>
-        <w:br/>
-        <w:t>String d = a;</w:t>
-      </w:r>
-      <w:r>
-        <w:rPr>
-          <w:rFonts w:ascii="Consolas" w:hAnsi="Consolas"/>
-          <w:color w:val="005078"/>
-          <w:sz w:val="18"/>
-        </w:rPr>
-        <w:br/>
-      </w:r>
-      <w:r>
-        <w:rPr>
-          <w:rFonts w:ascii="Consolas" w:hAnsi="Consolas"/>
-          <w:color w:val="005078"/>
-          <w:sz w:val="18"/>
-        </w:rPr>
-        <w:br/>
-        <w:t>System.out.println(a == b);</w:t>
-      </w:r>
-      <w:r>
-        <w:rPr>
-          <w:rFonts w:ascii="Consolas" w:hAnsi="Consolas"/>
-          <w:color w:val="005078"/>
-          <w:sz w:val="18"/>
-        </w:rPr>
-        <w:br/>
-        <w:t>System.out.println(a == c);</w:t>
-      </w:r>
-      <w:r>
-        <w:rPr>
-          <w:rFonts w:ascii="Consolas" w:hAnsi="Consolas"/>
-          <w:color w:val="005078"/>
-          <w:sz w:val="18"/>
-        </w:rPr>
-        <w:br/>
-        <w:t>System.out.println(a.equals(c));</w:t>
-      </w:r>
-      <w:r>
-        <w:rPr>
-          <w:rFonts w:ascii="Consolas" w:hAnsi="Consolas"/>
-          <w:color w:val="005078"/>
-          <w:sz w:val="18"/>
-        </w:rPr>
-        <w:br/>
-        <w:t>System.out.println(a == d);</w:t>
-      </w:r>
-      <w:r>
-        <w:rPr>
-          <w:rFonts w:ascii="Consolas" w:hAnsi="Consolas"/>
-          <w:color w:val="005078"/>
-          <w:sz w:val="18"/>
-        </w:rPr>
-        <w:br/>
-      </w:r>
-      <w:r>
-        <w:rPr>
-          <w:rFonts w:ascii="Consolas" w:hAnsi="Consolas"/>
-          <w:color w:val="005078"/>
-          <w:sz w:val="18"/>
-        </w:rPr>
-        <w:br/>
-        <w:t>a = a + " Zindabad";</w:t>
-      </w:r>
-      <w:r>
-        <w:rPr>
-          <w:rFonts w:ascii="Consolas" w:hAnsi="Consolas"/>
-          <w:color w:val="005078"/>
-          <w:sz w:val="18"/>
-        </w:rPr>
-        <w:br/>
-        <w:t>System.out.println(a);</w:t>
-      </w:r>
-      <w:r>
-        <w:rPr>
-          <w:rFonts w:ascii="Consolas" w:hAnsi="Consolas"/>
-          <w:color w:val="005078"/>
-          <w:sz w:val="18"/>
-        </w:rPr>
-        <w:br/>
-        <w:t>System.out.println(d);</w:t>
-      </w:r>
-      <w:r>
-        <w:rPr>
-          <w:rFonts w:ascii="Consolas" w:hAnsi="Consolas"/>
-          <w:color w:val="005078"/>
-          <w:sz w:val="18"/>
-        </w:rPr>
-        <w:br/>
-        <w:t>System.out.println(a == d);</w:t>
-      </w:r>
-    </w:p>
-    <w:p>
-      <w:pPr>
-        <w:pStyle w:val="Heading2"/>
-      </w:pPr>
-      <w:r>
-        <w:t>Exercise 4: toString and equals for Student</w:t>
-      </w:r>
-    </w:p>
-    <w:p>
-      <w:r>
-        <w:t>Create a Student class with: name (String), rollNumber (int), cgpa (double).</w:t>
-      </w:r>
-    </w:p>
-    <w:p>
-      <w:pPr>
-        <w:pStyle w:val="ListBullet"/>
-      </w:pPr>
-      <w:r>
-        <w:t>Override toString() to return: "Ali (FA24-BCS-001) — CGPA: 3.85"</w:t>
-      </w:r>
-    </w:p>
-    <w:p>
-      <w:pPr>
-        <w:pStyle w:val="ListBullet"/>
-      </w:pPr>
-      <w:r>
-        <w:lastRenderedPageBreak/>
-        <w:t>Override equals() to consider two students equal if they have the same rollNumber</w:t>
-      </w:r>
-    </w:p>
-    <w:p>
-      <w:pPr>
-        <w:pStyle w:val="ListBullet"/>
-      </w:pPr>
-      <w:r>
-        <w:t>Write a test program with two students having the same roll number but different names, and verify equals() returns true</w:t>
-      </w:r>
-    </w:p>
-    <w:p>
-      <w:pPr>
-        <w:pStyle w:val="Heading2"/>
-      </w:pPr>
-      <w:r>
-        <w:t>Exercise 5: ArrayList with equals</w:t>
-      </w:r>
-    </w:p>
-    <w:p>
-      <w:r>
-        <w:t>Using the Student class from Exercise 4:</w:t>
-      </w:r>
-    </w:p>
-    <w:p>
-      <w:pPr>
-        <w:pStyle w:val="ListBullet"/>
-      </w:pPr>
-      <w:r>
-        <w:t>Create an ArrayList&lt;Student&gt; with 5 students</w:t>
-      </w:r>
-    </w:p>
-    <w:p>
-      <w:pPr>
-        <w:pStyle w:val="ListBullet"/>
-      </w:pPr>
-      <w:r>
-        <w:t>Use the contains() method to check if a student with a specific roll number exists</w:t>
-      </w:r>
-    </w:p>
-    <w:p>
-      <w:pPr>
-        <w:pStyle w:val="ListBullet"/>
-      </w:pPr>
-      <w:r>
-        <w:t>Hint: contains() internally uses equals() — your override makes this work!</w:t>
-      </w:r>
-    </w:p>
     <w:p>
       <w:r>
         <w:br w:type="page"/>
@@ -3148,7 +2852,7 @@
   <w:abstractNum w:abstractNumId="6" w15:restartNumberingAfterBreak="0">
     <w:nsid w:val="FFFFFF83"/>
     <w:multiLevelType w:val="singleLevel"/>
-    <w:tmpl w:val="3D1EFFD4"/>
+    <w:tmpl w:val="CB7292AE"/>
     <w:lvl w:ilvl="0">
       <w:start w:val="1"/>
       <w:numFmt w:val="bullet"/>
@@ -3187,7 +2891,7 @@
   <w:abstractNum w:abstractNumId="8" w15:restartNumberingAfterBreak="0">
     <w:nsid w:val="FFFFFF89"/>
     <w:multiLevelType w:val="singleLevel"/>
-    <w:tmpl w:val="29761A62"/>
+    <w:tmpl w:val="B1A48452"/>
     <w:lvl w:ilvl="0">
       <w:start w:val="1"/>
       <w:numFmt w:val="bullet"/>

</xml_diff>